<commit_message>
Digitale Messstationen in Abschlussaufgabe klarstellen
</commit_message>
<xml_diff>
--- a/material/aufgabenblaetter/Abschlussaufgabe_Sportfest_Wissensstationen_mit_Erwartungshorizont.docx
+++ b/material/aufgabenblaetter/Abschlussaufgabe_Sportfest_Wissensstationen_mit_Erwartungshorizont.docx
@@ -113,6 +113,17 @@
           <w:sz w:val="21"/>
         </w:rPr>
         <w:t>Die Station verbindet Sport mit mindestens einem weiteren Unterrichtsfach. Der Beitrag jedes beteiligten Faches muss für die Bearbeitung der Leitfrage notwendig sein. Eine reine Quiz-, Informations- oder Unterhaltungsstation erfüllt diesen Anspruch nicht.</w:t>
+      </w:r>
+    </w:p>
+    <w:p>
+      <w:pPr/>
+      <w:r>
+        <w:rPr>
+          <w:rFonts w:ascii="Arial" w:hAnsi="Arial"/>
+          <w:color w:val="1F1F1F"/>
+          <w:sz w:val="21"/>
+        </w:rPr>
+        <w:t>Digitale Messstationen mit Smartphone, Sensoren, Videoanalyse, Tabellenkalkulation oder selbst entwickelten Anwendungen sind ausdrücklich möglich. Entscheidend ist, dass ihr fachlicher Zweck, ihre Messlogik und die Aussagekraft der gewonnenen Daten nachvollziehbar werden.</w:t>
       </w:r>
     </w:p>
     <w:p>
@@ -640,7 +651,7 @@
                 <w:color w:val="1F1F1F"/>
                 <w:sz w:val="18"/>
               </w:rPr>
-              <w:t>Benötigt werden schulnah verfügbare Materialien. Für digitale Technik gibt es eine einfache Offline- oder Analoglösung.</w:t>
+              <w:t>Digitale Mess-, Sensor- und Auswertungstechnik ist ausdrücklich möglich und kann den fachlichen Kern der Station bilden. Geräte, Strom, Netzwerk und Datenübertragung werden realistisch geplant.</w:t>
             </w:r>
           </w:p>
         </w:tc>
@@ -792,7 +803,7 @@
           <w:color w:val="1F1F1F"/>
           <w:sz w:val="20"/>
         </w:rPr>
-        <w:t>Einfache Ersatzlösung für den Ausfall von Netzwerk, Gerät oder Software</w:t>
+        <w:t>realistischer Umgang mit technischen Störungen und, soweit sinnvoll, eine Ersatz- oder Überbrückungslösung</w:t>
       </w:r>
     </w:p>
     <w:p>
@@ -1487,7 +1498,7 @@
                 <w:color w:val="1F1F1F"/>
                 <w:sz w:val="17"/>
               </w:rPr>
-              <w:t>Zeit, Gruppengröße, Durchsatz, Betreuung, Aufbau, Rückstellung, Raum und Material sind realistisch geplant. Störungen durch Wetter, Lärm, Netz- oder Geräteausfall werden berücksichtigt. Die Ersatzlösung ist durchführbar.</w:t>
+              <w:t>Zeit, Gruppengröße, Durchsatz, Betreuung, Aufbau, Rückstellung, Raum und Material sind realistisch geplant. Technische Voraussetzungen und mögliche Störungen werden angemessen berücksichtigt; eine sinnvolle Überbrückungs- oder Ersatzstrategie ist beschrieben.</w:t>
             </w:r>
           </w:p>
         </w:tc>

</xml_diff>